<commit_message>
Adding notes for nestjs
</commit_message>
<xml_diff>
--- a/NestJS/from-docs/nestjs-notes-02.docx
+++ b/NestJS/from-docs/nestjs-notes-02.docx
@@ -224,6 +224,520 @@
           <w:szCs w:val="28"/>
         </w:rPr>
       </w:pPr>
+      <w:r>
+        <w:rPr>
+          <w:noProof/>
+        </w:rPr>
+        <w:drawing>
+          <wp:inline distT="0" distB="0" distL="0" distR="0" wp14:anchorId="5D01EF20" wp14:editId="07D1CB3D">
+            <wp:extent cx="5943600" cy="1361440"/>
+            <wp:effectExtent l="0" t="0" r="0" b="0"/>
+            <wp:docPr id="4" name="Picture 4"/>
+            <wp:cNvGraphicFramePr>
+              <a:graphicFrameLocks xmlns:a="http://schemas.openxmlformats.org/drawingml/2006/main" noChangeAspect="1"/>
+            </wp:cNvGraphicFramePr>
+            <a:graphic xmlns:a="http://schemas.openxmlformats.org/drawingml/2006/main">
+              <a:graphicData uri="http://schemas.openxmlformats.org/drawingml/2006/picture">
+                <pic:pic xmlns:pic="http://schemas.openxmlformats.org/drawingml/2006/picture">
+                  <pic:nvPicPr>
+                    <pic:cNvPr id="1" name=""/>
+                    <pic:cNvPicPr/>
+                  </pic:nvPicPr>
+                  <pic:blipFill>
+                    <a:blip r:embed="rId7"/>
+                    <a:stretch>
+                      <a:fillRect/>
+                    </a:stretch>
+                  </pic:blipFill>
+                  <pic:spPr>
+                    <a:xfrm>
+                      <a:off x="0" y="0"/>
+                      <a:ext cx="5943600" cy="1361440"/>
+                    </a:xfrm>
+                    <a:prstGeom prst="rect">
+                      <a:avLst/>
+                    </a:prstGeom>
+                  </pic:spPr>
+                </pic:pic>
+              </a:graphicData>
+            </a:graphic>
+          </wp:inline>
+        </w:drawing>
+      </w:r>
+    </w:p>
+    <w:p>
+      <w:pPr>
+        <w:ind w:left="720" w:firstLine="720"/>
+        <w:rPr>
+          <w:rFonts w:ascii="Sakkal Majalla" w:hAnsi="Sakkal Majalla" w:cs="Sakkal Majalla"/>
+          <w:sz w:val="28"/>
+          <w:szCs w:val="28"/>
+        </w:rPr>
+      </w:pPr>
+      <w:r>
+        <w:rPr>
+          <w:rFonts w:ascii="Sakkal Majalla" w:hAnsi="Sakkal Majalla" w:cs="Sakkal Majalla"/>
+          <w:sz w:val="28"/>
+          <w:szCs w:val="28"/>
+        </w:rPr>
+        <w:t>********************************************************</w:t>
+      </w:r>
+    </w:p>
+    <w:p>
+      <w:pPr>
+        <w:rPr>
+          <w:rFonts w:ascii="Sakkal Majalla" w:hAnsi="Sakkal Majalla" w:cs="Sakkal Majalla"/>
+          <w:sz w:val="28"/>
+          <w:szCs w:val="28"/>
+        </w:rPr>
+      </w:pPr>
+      <w:r>
+        <w:rPr>
+          <w:rFonts w:ascii="Sakkal Majalla" w:hAnsi="Sakkal Majalla" w:cs="Sakkal Majalla"/>
+          <w:sz w:val="28"/>
+          <w:szCs w:val="28"/>
+        </w:rPr>
+        <w:t xml:space="preserve">There are several ways to define a provider: you can use </w:t>
+      </w:r>
+      <w:r>
+        <w:rPr>
+          <w:rFonts w:ascii="Sakkal Majalla" w:hAnsi="Sakkal Majalla" w:cs="Sakkal Majalla"/>
+          <w:color w:val="C45911" w:themeColor="accent2" w:themeShade="BF"/>
+          <w:sz w:val="28"/>
+          <w:szCs w:val="28"/>
+        </w:rPr>
+        <w:t>plain values</w:t>
+      </w:r>
+      <w:r>
+        <w:rPr>
+          <w:rFonts w:ascii="Sakkal Majalla" w:hAnsi="Sakkal Majalla" w:cs="Sakkal Majalla"/>
+          <w:sz w:val="28"/>
+          <w:szCs w:val="28"/>
+        </w:rPr>
+        <w:t xml:space="preserve">, </w:t>
+      </w:r>
+      <w:r>
+        <w:rPr>
+          <w:rFonts w:ascii="Sakkal Majalla" w:hAnsi="Sakkal Majalla" w:cs="Sakkal Majalla"/>
+          <w:color w:val="C45911" w:themeColor="accent2" w:themeShade="BF"/>
+          <w:sz w:val="28"/>
+          <w:szCs w:val="28"/>
+        </w:rPr>
+        <w:t>classes</w:t>
+      </w:r>
+      <w:r>
+        <w:rPr>
+          <w:rFonts w:ascii="Sakkal Majalla" w:hAnsi="Sakkal Majalla" w:cs="Sakkal Majalla"/>
+          <w:sz w:val="28"/>
+          <w:szCs w:val="28"/>
+        </w:rPr>
+        <w:t xml:space="preserve">, and </w:t>
+      </w:r>
+      <w:r>
+        <w:rPr>
+          <w:rFonts w:ascii="Sakkal Majalla" w:hAnsi="Sakkal Majalla" w:cs="Sakkal Majalla"/>
+          <w:sz w:val="28"/>
+          <w:szCs w:val="28"/>
+        </w:rPr>
+        <w:t xml:space="preserve">either </w:t>
+      </w:r>
+      <w:r>
+        <w:rPr>
+          <w:rFonts w:ascii="Sakkal Majalla" w:hAnsi="Sakkal Majalla" w:cs="Sakkal Majalla"/>
+          <w:color w:val="C45911" w:themeColor="accent2" w:themeShade="BF"/>
+          <w:sz w:val="28"/>
+          <w:szCs w:val="28"/>
+        </w:rPr>
+        <w:t xml:space="preserve">asynchronous </w:t>
+      </w:r>
+      <w:r>
+        <w:rPr>
+          <w:rFonts w:ascii="Sakkal Majalla" w:hAnsi="Sakkal Majalla" w:cs="Sakkal Majalla"/>
+          <w:sz w:val="28"/>
+          <w:szCs w:val="28"/>
+        </w:rPr>
+        <w:t>or</w:t>
+      </w:r>
+      <w:r>
+        <w:rPr>
+          <w:rFonts w:ascii="Sakkal Majalla" w:hAnsi="Sakkal Majalla" w:cs="Sakkal Majalla"/>
+          <w:sz w:val="28"/>
+          <w:szCs w:val="28"/>
+        </w:rPr>
+        <w:t xml:space="preserve"> </w:t>
+      </w:r>
+      <w:r>
+        <w:rPr>
+          <w:rFonts w:ascii="Sakkal Majalla" w:hAnsi="Sakkal Majalla" w:cs="Sakkal Majalla"/>
+          <w:color w:val="C45911" w:themeColor="accent2" w:themeShade="BF"/>
+          <w:sz w:val="28"/>
+          <w:szCs w:val="28"/>
+        </w:rPr>
+        <w:t xml:space="preserve">synchronous </w:t>
+      </w:r>
+      <w:r>
+        <w:rPr>
+          <w:rFonts w:ascii="Sakkal Majalla" w:hAnsi="Sakkal Majalla" w:cs="Sakkal Majalla"/>
+          <w:sz w:val="28"/>
+          <w:szCs w:val="28"/>
+        </w:rPr>
+        <w:t>factories. </w:t>
+      </w:r>
+    </w:p>
+    <w:p>
+      <w:pPr>
+        <w:ind w:left="720" w:firstLine="720"/>
+        <w:rPr>
+          <w:rFonts w:ascii="Sakkal Majalla" w:hAnsi="Sakkal Majalla" w:cs="Sakkal Majalla"/>
+          <w:sz w:val="28"/>
+          <w:szCs w:val="28"/>
+        </w:rPr>
+      </w:pPr>
+      <w:r>
+        <w:rPr>
+          <w:rFonts w:ascii="Sakkal Majalla" w:hAnsi="Sakkal Majalla" w:cs="Sakkal Majalla"/>
+          <w:sz w:val="28"/>
+          <w:szCs w:val="28"/>
+        </w:rPr>
+        <w:t>********************************************************</w:t>
+      </w:r>
+    </w:p>
+    <w:p>
+      <w:pPr>
+        <w:rPr>
+          <w:rFonts w:ascii="Sakkal Majalla" w:hAnsi="Sakkal Majalla" w:cs="Sakkal Majalla"/>
+          <w:sz w:val="28"/>
+          <w:szCs w:val="28"/>
+        </w:rPr>
+      </w:pPr>
+      <w:r>
+        <w:rPr>
+          <w:noProof/>
+        </w:rPr>
+        <w:lastRenderedPageBreak/>
+        <w:drawing>
+          <wp:inline distT="0" distB="0" distL="0" distR="0" wp14:anchorId="42A0C3B1" wp14:editId="4CE53570">
+            <wp:extent cx="5943600" cy="3475355"/>
+            <wp:effectExtent l="0" t="0" r="0" b="0"/>
+            <wp:docPr id="5" name="Picture 5"/>
+            <wp:cNvGraphicFramePr>
+              <a:graphicFrameLocks xmlns:a="http://schemas.openxmlformats.org/drawingml/2006/main" noChangeAspect="1"/>
+            </wp:cNvGraphicFramePr>
+            <a:graphic xmlns:a="http://schemas.openxmlformats.org/drawingml/2006/main">
+              <a:graphicData uri="http://schemas.openxmlformats.org/drawingml/2006/picture">
+                <pic:pic xmlns:pic="http://schemas.openxmlformats.org/drawingml/2006/picture">
+                  <pic:nvPicPr>
+                    <pic:cNvPr id="1" name=""/>
+                    <pic:cNvPicPr/>
+                  </pic:nvPicPr>
+                  <pic:blipFill>
+                    <a:blip r:embed="rId8"/>
+                    <a:stretch>
+                      <a:fillRect/>
+                    </a:stretch>
+                  </pic:blipFill>
+                  <pic:spPr>
+                    <a:xfrm>
+                      <a:off x="0" y="0"/>
+                      <a:ext cx="5943600" cy="3475355"/>
+                    </a:xfrm>
+                    <a:prstGeom prst="rect">
+                      <a:avLst/>
+                    </a:prstGeom>
+                  </pic:spPr>
+                </pic:pic>
+              </a:graphicData>
+            </a:graphic>
+          </wp:inline>
+        </w:drawing>
+      </w:r>
+    </w:p>
+    <w:p>
+      <w:pPr>
+        <w:ind w:left="720" w:firstLine="720"/>
+        <w:rPr>
+          <w:rFonts w:ascii="Sakkal Majalla" w:hAnsi="Sakkal Majalla" w:cs="Sakkal Majalla"/>
+          <w:sz w:val="28"/>
+          <w:szCs w:val="28"/>
+        </w:rPr>
+      </w:pPr>
+      <w:r>
+        <w:rPr>
+          <w:rFonts w:ascii="Sakkal Majalla" w:hAnsi="Sakkal Majalla" w:cs="Sakkal Majalla"/>
+          <w:sz w:val="28"/>
+          <w:szCs w:val="28"/>
+        </w:rPr>
+        <w:t>********************************************************</w:t>
+      </w:r>
+    </w:p>
+    <w:p>
+      <w:pPr>
+        <w:rPr>
+          <w:rFonts w:ascii="Sakkal Majalla" w:hAnsi="Sakkal Majalla" w:cs="Sakkal Majalla"/>
+          <w:sz w:val="28"/>
+          <w:szCs w:val="28"/>
+        </w:rPr>
+      </w:pPr>
+      <w:r>
+        <w:rPr>
+          <w:noProof/>
+        </w:rPr>
+        <w:drawing>
+          <wp:inline distT="0" distB="0" distL="0" distR="0" wp14:anchorId="4F32D172" wp14:editId="2E0A6FC0">
+            <wp:extent cx="5943600" cy="3587750"/>
+            <wp:effectExtent l="0" t="0" r="0" b="0"/>
+            <wp:docPr id="6" name="Picture 6"/>
+            <wp:cNvGraphicFramePr>
+              <a:graphicFrameLocks xmlns:a="http://schemas.openxmlformats.org/drawingml/2006/main" noChangeAspect="1"/>
+            </wp:cNvGraphicFramePr>
+            <a:graphic xmlns:a="http://schemas.openxmlformats.org/drawingml/2006/main">
+              <a:graphicData uri="http://schemas.openxmlformats.org/drawingml/2006/picture">
+                <pic:pic xmlns:pic="http://schemas.openxmlformats.org/drawingml/2006/picture">
+                  <pic:nvPicPr>
+                    <pic:cNvPr id="1" name=""/>
+                    <pic:cNvPicPr/>
+                  </pic:nvPicPr>
+                  <pic:blipFill>
+                    <a:blip r:embed="rId9"/>
+                    <a:stretch>
+                      <a:fillRect/>
+                    </a:stretch>
+                  </pic:blipFill>
+                  <pic:spPr>
+                    <a:xfrm>
+                      <a:off x="0" y="0"/>
+                      <a:ext cx="5943600" cy="3587750"/>
+                    </a:xfrm>
+                    <a:prstGeom prst="rect">
+                      <a:avLst/>
+                    </a:prstGeom>
+                  </pic:spPr>
+                </pic:pic>
+              </a:graphicData>
+            </a:graphic>
+          </wp:inline>
+        </w:drawing>
+      </w:r>
+    </w:p>
+    <w:p>
+      <w:pPr>
+        <w:ind w:left="720" w:firstLine="720"/>
+        <w:rPr>
+          <w:rFonts w:ascii="Sakkal Majalla" w:hAnsi="Sakkal Majalla" w:cs="Sakkal Majalla"/>
+          <w:sz w:val="28"/>
+          <w:szCs w:val="28"/>
+        </w:rPr>
+      </w:pPr>
+      <w:r>
+        <w:rPr>
+          <w:rFonts w:ascii="Sakkal Majalla" w:hAnsi="Sakkal Majalla" w:cs="Sakkal Majalla"/>
+          <w:sz w:val="28"/>
+          <w:szCs w:val="28"/>
+        </w:rPr>
+        <w:t>********************************************************</w:t>
+      </w:r>
+    </w:p>
+    <w:p>
+      <w:pPr>
+        <w:rPr>
+          <w:rFonts w:ascii="Sakkal Majalla" w:hAnsi="Sakkal Majalla" w:cs="Sakkal Majalla"/>
+          <w:sz w:val="28"/>
+          <w:szCs w:val="28"/>
+        </w:rPr>
+      </w:pPr>
+      <w:r>
+        <w:rPr>
+          <w:noProof/>
+        </w:rPr>
+        <w:lastRenderedPageBreak/>
+        <w:drawing>
+          <wp:inline distT="0" distB="0" distL="0" distR="0" wp14:anchorId="261AAA60" wp14:editId="4F9F04BC">
+            <wp:extent cx="5943600" cy="1267460"/>
+            <wp:effectExtent l="0" t="0" r="0" b="8890"/>
+            <wp:docPr id="7" name="Picture 7"/>
+            <wp:cNvGraphicFramePr>
+              <a:graphicFrameLocks xmlns:a="http://schemas.openxmlformats.org/drawingml/2006/main" noChangeAspect="1"/>
+            </wp:cNvGraphicFramePr>
+            <a:graphic xmlns:a="http://schemas.openxmlformats.org/drawingml/2006/main">
+              <a:graphicData uri="http://schemas.openxmlformats.org/drawingml/2006/picture">
+                <pic:pic xmlns:pic="http://schemas.openxmlformats.org/drawingml/2006/picture">
+                  <pic:nvPicPr>
+                    <pic:cNvPr id="1" name=""/>
+                    <pic:cNvPicPr/>
+                  </pic:nvPicPr>
+                  <pic:blipFill>
+                    <a:blip r:embed="rId10"/>
+                    <a:stretch>
+                      <a:fillRect/>
+                    </a:stretch>
+                  </pic:blipFill>
+                  <pic:spPr>
+                    <a:xfrm>
+                      <a:off x="0" y="0"/>
+                      <a:ext cx="5943600" cy="1267460"/>
+                    </a:xfrm>
+                    <a:prstGeom prst="rect">
+                      <a:avLst/>
+                    </a:prstGeom>
+                  </pic:spPr>
+                </pic:pic>
+              </a:graphicData>
+            </a:graphic>
+          </wp:inline>
+        </w:drawing>
+      </w:r>
+    </w:p>
+    <w:p>
+      <w:pPr>
+        <w:ind w:left="720" w:firstLine="720"/>
+        <w:rPr>
+          <w:rFonts w:ascii="Sakkal Majalla" w:hAnsi="Sakkal Majalla" w:cs="Sakkal Majalla"/>
+          <w:sz w:val="28"/>
+          <w:szCs w:val="28"/>
+        </w:rPr>
+      </w:pPr>
+      <w:r>
+        <w:rPr>
+          <w:rFonts w:ascii="Sakkal Majalla" w:hAnsi="Sakkal Majalla" w:cs="Sakkal Majalla"/>
+          <w:sz w:val="28"/>
+          <w:szCs w:val="28"/>
+        </w:rPr>
+        <w:t>********************************************************</w:t>
+      </w:r>
+    </w:p>
+    <w:p>
+      <w:pPr>
+        <w:rPr>
+          <w:rFonts w:ascii="Sakkal Majalla" w:hAnsi="Sakkal Majalla" w:cs="Sakkal Majalla"/>
+          <w:sz w:val="28"/>
+          <w:szCs w:val="28"/>
+        </w:rPr>
+      </w:pPr>
+      <w:r>
+        <w:rPr>
+          <w:noProof/>
+        </w:rPr>
+        <w:drawing>
+          <wp:inline distT="0" distB="0" distL="0" distR="0" wp14:anchorId="00AA6DF9" wp14:editId="4F056C1A">
+            <wp:extent cx="5943600" cy="3477260"/>
+            <wp:effectExtent l="0" t="0" r="0" b="8890"/>
+            <wp:docPr id="8" name="Picture 8"/>
+            <wp:cNvGraphicFramePr>
+              <a:graphicFrameLocks xmlns:a="http://schemas.openxmlformats.org/drawingml/2006/main" noChangeAspect="1"/>
+            </wp:cNvGraphicFramePr>
+            <a:graphic xmlns:a="http://schemas.openxmlformats.org/drawingml/2006/main">
+              <a:graphicData uri="http://schemas.openxmlformats.org/drawingml/2006/picture">
+                <pic:pic xmlns:pic="http://schemas.openxmlformats.org/drawingml/2006/picture">
+                  <pic:nvPicPr>
+                    <pic:cNvPr id="1" name=""/>
+                    <pic:cNvPicPr/>
+                  </pic:nvPicPr>
+                  <pic:blipFill>
+                    <a:blip r:embed="rId11"/>
+                    <a:stretch>
+                      <a:fillRect/>
+                    </a:stretch>
+                  </pic:blipFill>
+                  <pic:spPr>
+                    <a:xfrm>
+                      <a:off x="0" y="0"/>
+                      <a:ext cx="5943600" cy="3477260"/>
+                    </a:xfrm>
+                    <a:prstGeom prst="rect">
+                      <a:avLst/>
+                    </a:prstGeom>
+                  </pic:spPr>
+                </pic:pic>
+              </a:graphicData>
+            </a:graphic>
+          </wp:inline>
+        </w:drawing>
+      </w:r>
+    </w:p>
+    <w:p>
+      <w:pPr>
+        <w:ind w:left="720" w:firstLine="720"/>
+        <w:rPr>
+          <w:rFonts w:ascii="Sakkal Majalla" w:hAnsi="Sakkal Majalla" w:cs="Sakkal Majalla"/>
+          <w:sz w:val="28"/>
+          <w:szCs w:val="28"/>
+        </w:rPr>
+      </w:pPr>
+      <w:r>
+        <w:rPr>
+          <w:rFonts w:ascii="Sakkal Majalla" w:hAnsi="Sakkal Majalla" w:cs="Sakkal Majalla"/>
+          <w:sz w:val="28"/>
+          <w:szCs w:val="28"/>
+        </w:rPr>
+        <w:t>********************************************************</w:t>
+      </w:r>
+    </w:p>
+    <w:p>
+      <w:pPr>
+        <w:rPr>
+          <w:rFonts w:ascii="Sakkal Majalla" w:hAnsi="Sakkal Majalla" w:cs="Sakkal Majalla"/>
+          <w:sz w:val="28"/>
+          <w:szCs w:val="28"/>
+        </w:rPr>
+      </w:pPr>
+      <w:r>
+        <w:rPr>
+          <w:noProof/>
+        </w:rPr>
+        <w:drawing>
+          <wp:inline distT="0" distB="0" distL="0" distR="0" wp14:anchorId="16ED246D" wp14:editId="390B77AB">
+            <wp:extent cx="6296025" cy="2133600"/>
+            <wp:effectExtent l="0" t="0" r="9525" b="0"/>
+            <wp:docPr id="9" name="Picture 9"/>
+            <wp:cNvGraphicFramePr>
+              <a:graphicFrameLocks xmlns:a="http://schemas.openxmlformats.org/drawingml/2006/main" noChangeAspect="1"/>
+            </wp:cNvGraphicFramePr>
+            <a:graphic xmlns:a="http://schemas.openxmlformats.org/drawingml/2006/main">
+              <a:graphicData uri="http://schemas.openxmlformats.org/drawingml/2006/picture">
+                <pic:pic xmlns:pic="http://schemas.openxmlformats.org/drawingml/2006/picture">
+                  <pic:nvPicPr>
+                    <pic:cNvPr id="1" name=""/>
+                    <pic:cNvPicPr/>
+                  </pic:nvPicPr>
+                  <pic:blipFill>
+                    <a:blip r:embed="rId12"/>
+                    <a:stretch>
+                      <a:fillRect/>
+                    </a:stretch>
+                  </pic:blipFill>
+                  <pic:spPr>
+                    <a:xfrm>
+                      <a:off x="0" y="0"/>
+                      <a:ext cx="6306288" cy="2137078"/>
+                    </a:xfrm>
+                    <a:prstGeom prst="rect">
+                      <a:avLst/>
+                    </a:prstGeom>
+                  </pic:spPr>
+                </pic:pic>
+              </a:graphicData>
+            </a:graphic>
+          </wp:inline>
+        </w:drawing>
+      </w:r>
+    </w:p>
+    <w:p>
+      <w:pPr>
+        <w:ind w:left="720" w:firstLine="720"/>
+        <w:rPr>
+          <w:rFonts w:ascii="Sakkal Majalla" w:hAnsi="Sakkal Majalla" w:cs="Sakkal Majalla"/>
+          <w:sz w:val="28"/>
+          <w:szCs w:val="28"/>
+        </w:rPr>
+      </w:pPr>
+      <w:r>
+        <w:rPr>
+          <w:rFonts w:ascii="Sakkal Majalla" w:hAnsi="Sakkal Majalla" w:cs="Sakkal Majalla"/>
+          <w:sz w:val="28"/>
+          <w:szCs w:val="28"/>
+        </w:rPr>
+        <w:t>********************************************************</w:t>
+      </w:r>
       <w:bookmarkStart w:id="0" w:name="_GoBack"/>
       <w:bookmarkEnd w:id="0"/>
     </w:p>
@@ -630,12 +1144,11 @@
   <w:style w:type="paragraph" w:default="1" w:styleId="Normal">
     <w:name w:val="Normal"/>
     <w:qFormat/>
-    <w:rsid w:val="0005746E"/>
+    <w:rsid w:val="007B3A6C"/>
   </w:style>
   <w:style w:type="character" w:default="1" w:styleId="DefaultParagraphFont">
     <w:name w:val="Default Paragraph Font"/>
     <w:uiPriority w:val="1"/>
-    <w:semiHidden/>
     <w:unhideWhenUsed/>
   </w:style>
   <w:style w:type="table" w:default="1" w:styleId="TableNormal">

</xml_diff>